<commit_message>
FIX: de codigo de roles
</commit_message>
<xml_diff>
--- a/specs/00-modulo-talento-humano.docx
+++ b/specs/00-modulo-talento-humano.docx
@@ -6217,6 +6217,787 @@
       </w:r>
       <w:r>
         <w:t xml:space="preserve">) (spec 03 §12.7).</w:t>
+      </w:r>
+    </w:p>
+    <w:p>
+      <w:pPr>
+        <w:pStyle w:val="Compact"/>
+        <w:numPr>
+          <w:ilvl w:val="0"/>
+          <w:numId w:val="1012"/>
+        </w:numPr>
+      </w:pPr>
+      <w:r>
+        <w:rPr>
+          <w:b/>
+          <w:bCs/>
+        </w:rPr>
+        <w:t xml:space="preserve">Segunda tanda (2026-09-02):</w:t>
+      </w:r>
+    </w:p>
+    <w:p>
+      <w:pPr>
+        <w:pStyle w:val="Compact"/>
+        <w:numPr>
+          <w:ilvl w:val="1"/>
+          <w:numId w:val="1014"/>
+        </w:numPr>
+      </w:pPr>
+      <w:r>
+        <w:rPr>
+          <w:rStyle w:val="VerbatimChar"/>
+        </w:rPr>
+        <w:t xml:space="preserve">ProcesarCuadre</w:t>
+      </w:r>
+      <w:r>
+        <w:t xml:space="preserve"> </w:t>
+      </w:r>
+      <w:r>
+        <w:t xml:space="preserve">filtra</w:t>
+      </w:r>
+      <w:r>
+        <w:t xml:space="preserve"> </w:t>
+      </w:r>
+      <w:r>
+        <w:rPr>
+          <w:rStyle w:val="VerbatimChar"/>
+        </w:rPr>
+        <w:t xml:space="preserve">id_depto != 999</w:t>
+      </w:r>
+      <w:r>
+        <w:t xml:space="preserve"> </w:t>
+      </w:r>
+      <w:r>
+        <w:t xml:space="preserve">y</w:t>
+      </w:r>
+      <w:r>
+        <w:t xml:space="preserve"> </w:t>
+      </w:r>
+      <w:r>
+        <w:rPr>
+          <w:rStyle w:val="VerbatimChar"/>
+        </w:rPr>
+        <w:t xml:space="preserve">es_externo</w:t>
+      </w:r>
+      <w:r>
+        <w:t xml:space="preserve"> </w:t>
+      </w:r>
+      <w:r>
+        <w:t xml:space="preserve">false/null; turno incompleto →</w:t>
+      </w:r>
+      <w:r>
+        <w:t xml:space="preserve"> </w:t>
+      </w:r>
+      <w:r>
+        <w:t xml:space="preserve">atrasos en 0 +</w:t>
+      </w:r>
+      <w:r>
+        <w:t xml:space="preserve"> </w:t>
+      </w:r>
+      <w:r>
+        <w:rPr>
+          <w:rStyle w:val="VerbatimChar"/>
+        </w:rPr>
+        <w:t xml:space="preserve">warn</w:t>
+      </w:r>
+      <w:r>
+        <w:t xml:space="preserve"> </w:t>
+      </w:r>
+      <w:r>
+        <w:t xml:space="preserve">(spec 03 §12.1–2).</w:t>
+      </w:r>
+    </w:p>
+    <w:p>
+      <w:pPr>
+        <w:pStyle w:val="Compact"/>
+        <w:numPr>
+          <w:ilvl w:val="1"/>
+          <w:numId w:val="1014"/>
+        </w:numPr>
+      </w:pPr>
+      <w:r>
+        <w:rPr>
+          <w:rStyle w:val="VerbatimChar"/>
+        </w:rPr>
+        <w:t xml:space="preserve">importarDistributivo</w:t>
+      </w:r>
+      <w:r>
+        <w:t xml:space="preserve"> </w:t>
+      </w:r>
+      <w:r>
+        <w:t xml:space="preserve">transaccional + auditoría</w:t>
+      </w:r>
+      <w:r>
+        <w:t xml:space="preserve"> </w:t>
+      </w:r>
+      <w:r>
+        <w:rPr>
+          <w:rStyle w:val="VerbatimChar"/>
+        </w:rPr>
+        <w:t xml:space="preserve">IMPORTACION_DISTRIBUTIVO</w:t>
+      </w:r>
+      <w:r>
+        <w:t xml:space="preserve"> </w:t>
+      </w:r>
+      <w:r>
+        <w:t xml:space="preserve">+ resolución de</w:t>
+      </w:r>
+      <w:r>
+        <w:t xml:space="preserve"> </w:t>
+      </w:r>
+      <w:r>
+        <w:t xml:space="preserve">columnas por nombre (spec 01 §10.4).</w:t>
+      </w:r>
+    </w:p>
+    <w:p>
+      <w:pPr>
+        <w:pStyle w:val="Compact"/>
+        <w:numPr>
+          <w:ilvl w:val="1"/>
+          <w:numId w:val="1014"/>
+        </w:numPr>
+      </w:pPr>
+      <w:r>
+        <w:t xml:space="preserve">Typo</w:t>
+      </w:r>
+      <w:r>
+        <w:t xml:space="preserve"> </w:t>
+      </w:r>
+      <w:r>
+        <w:rPr>
+          <w:rStyle w:val="VerbatimChar"/>
+        </w:rPr>
+        <w:t xml:space="preserve">nullable</w:t>
+      </w:r>
+      <w:r>
+        <w:t xml:space="preserve"> </w:t>
+      </w:r>
+      <w:r>
+        <w:t xml:space="preserve">en la validación de períodos de planificación (spec 05 §12.8).</w:t>
+      </w:r>
+    </w:p>
+    <w:p>
+      <w:pPr>
+        <w:pStyle w:val="Compact"/>
+        <w:numPr>
+          <w:ilvl w:val="0"/>
+          <w:numId w:val="1012"/>
+        </w:numPr>
+      </w:pPr>
+      <w:r>
+        <w:rPr>
+          <w:b/>
+          <w:bCs/>
+        </w:rPr>
+        <w:t xml:space="preserve">Robustez y trazabilidad P2 (2026-09-01):</w:t>
+      </w:r>
+    </w:p>
+    <w:p>
+      <w:pPr>
+        <w:pStyle w:val="Compact"/>
+        <w:numPr>
+          <w:ilvl w:val="1"/>
+          <w:numId w:val="1015"/>
+        </w:numPr>
+      </w:pPr>
+      <w:r>
+        <w:rPr>
+          <w:rStyle w:val="VerbatimChar"/>
+        </w:rPr>
+        <w:t xml:space="preserve">EmpleadoController::destroy</w:t>
+      </w:r>
+      <w:r>
+        <w:t xml:space="preserve"> </w:t>
+      </w:r>
+      <w:r>
+        <w:t xml:space="preserve">audita</w:t>
+      </w:r>
+      <w:r>
+        <w:t xml:space="preserve"> </w:t>
+      </w:r>
+      <w:r>
+        <w:rPr>
+          <w:rStyle w:val="VerbatimChar"/>
+        </w:rPr>
+        <w:t xml:space="preserve">DESACTIVAR</w:t>
+      </w:r>
+      <w:r>
+        <w:t xml:space="preserve"> </w:t>
+      </w:r>
+      <w:r>
+        <w:t xml:space="preserve">+ fuerza</w:t>
+      </w:r>
+      <w:r>
+        <w:t xml:space="preserve"> </w:t>
+      </w:r>
+      <w:r>
+        <w:rPr>
+          <w:rStyle w:val="VerbatimChar"/>
+        </w:rPr>
+        <w:t xml:space="preserve">estado_puesto = DISPONIBLE</w:t>
+      </w:r>
+      <w:r>
+        <w:t xml:space="preserve">;</w:t>
+      </w:r>
+      <w:r>
+        <w:t xml:space="preserve"> </w:t>
+      </w:r>
+      <w:r>
+        <w:rPr>
+          <w:rStyle w:val="VerbatimChar"/>
+        </w:rPr>
+        <w:t xml:space="preserve">eliminarDocSustituta</w:t>
+      </w:r>
+      <w:r>
+        <w:t xml:space="preserve"> </w:t>
+      </w:r>
+      <w:r>
+        <w:t xml:space="preserve">limpia los 4 campos;</w:t>
+      </w:r>
+      <w:r>
+        <w:t xml:space="preserve"> </w:t>
+      </w:r>
+      <w:r>
+        <w:rPr>
+          <w:rStyle w:val="VerbatimChar"/>
+        </w:rPr>
+        <w:t xml:space="preserve">departamentos()</w:t>
+      </w:r>
+      <w:r>
+        <w:t xml:space="preserve"> </w:t>
+      </w:r>
+      <w:r>
+        <w:t xml:space="preserve">excluye el 999;</w:t>
+      </w:r>
+      <w:r>
+        <w:t xml:space="preserve"> </w:t>
+      </w:r>
+      <w:r>
+        <w:rPr>
+          <w:rStyle w:val="VerbatimChar"/>
+        </w:rPr>
+        <w:t xml:space="preserve">jornada_id</w:t>
+      </w:r>
+      <w:r>
+        <w:t xml:space="preserve"> </w:t>
+      </w:r>
+      <w:r>
+        <w:t xml:space="preserve">dejó de escribirse (spec 01 §10).</w:t>
+      </w:r>
+    </w:p>
+    <w:p>
+      <w:pPr>
+        <w:pStyle w:val="Compact"/>
+        <w:numPr>
+          <w:ilvl w:val="1"/>
+          <w:numId w:val="1015"/>
+        </w:numPr>
+      </w:pPr>
+      <w:r>
+        <w:rPr>
+          <w:rStyle w:val="VerbatimChar"/>
+        </w:rPr>
+        <w:t xml:space="preserve">Empleado::generarSiguienteId()</w:t>
+      </w:r>
+      <w:r>
+        <w:t xml:space="preserve"> </w:t>
+      </w:r>
+      <w:r>
+        <w:t xml:space="preserve">con</w:t>
+      </w:r>
+      <w:r>
+        <w:t xml:space="preserve"> </w:t>
+      </w:r>
+      <w:r>
+        <w:rPr>
+          <w:rStyle w:val="VerbatimChar"/>
+        </w:rPr>
+        <w:t xml:space="preserve">pg_advisory_xact_lock</w:t>
+      </w:r>
+      <w:r>
+        <w:t xml:space="preserve"> </w:t>
+      </w:r>
+      <w:r>
+        <w:t xml:space="preserve">(usado por</w:t>
+      </w:r>
+      <w:r>
+        <w:t xml:space="preserve"> </w:t>
+      </w:r>
+      <w:r>
+        <w:rPr>
+          <w:rStyle w:val="VerbatimChar"/>
+        </w:rPr>
+        <w:t xml:space="preserve">store</w:t>
+      </w:r>
+      <w:r>
+        <w:t xml:space="preserve"> </w:t>
+      </w:r>
+      <w:r>
+        <w:t xml:space="preserve">e importación) —</w:t>
+      </w:r>
+      <w:r>
+        <w:t xml:space="preserve"> </w:t>
+      </w:r>
+      <w:r>
+        <w:t xml:space="preserve">fin de la colisión de</w:t>
+      </w:r>
+      <w:r>
+        <w:t xml:space="preserve"> </w:t>
+      </w:r>
+      <w:r>
+        <w:rPr>
+          <w:rStyle w:val="VerbatimChar"/>
+        </w:rPr>
+        <w:t xml:space="preserve">id_emp</w:t>
+      </w:r>
+      <w:r>
+        <w:t xml:space="preserve"> </w:t>
+      </w:r>
+      <w:r>
+        <w:t xml:space="preserve">(spec 01/02).</w:t>
+      </w:r>
+    </w:p>
+    <w:p>
+      <w:pPr>
+        <w:pStyle w:val="Compact"/>
+        <w:numPr>
+          <w:ilvl w:val="1"/>
+          <w:numId w:val="1015"/>
+        </w:numPr>
+      </w:pPr>
+      <w:r>
+        <w:t xml:space="preserve">Importación masiva valida</w:t>
+      </w:r>
+      <w:r>
+        <w:t xml:space="preserve"> </w:t>
+      </w:r>
+      <w:r>
+        <w:rPr>
+          <w:rStyle w:val="VerbatimChar"/>
+        </w:rPr>
+        <w:t xml:space="preserve">id_depto</w:t>
+      </w:r>
+      <w:r>
+        <w:t xml:space="preserve"> </w:t>
+      </w:r>
+      <w:r>
+        <w:t xml:space="preserve">contra</w:t>
+      </w:r>
+      <w:r>
+        <w:t xml:space="preserve"> </w:t>
+      </w:r>
+      <w:r>
+        <w:rPr>
+          <w:rStyle w:val="VerbatimChar"/>
+        </w:rPr>
+        <w:t xml:space="preserve">ad_departamento</w:t>
+      </w:r>
+      <w:r>
+        <w:t xml:space="preserve"> </w:t>
+      </w:r>
+      <w:r>
+        <w:t xml:space="preserve">(spec 02 §9.4).</w:t>
+      </w:r>
+    </w:p>
+    <w:p>
+      <w:pPr>
+        <w:pStyle w:val="Compact"/>
+        <w:numPr>
+          <w:ilvl w:val="1"/>
+          <w:numId w:val="1015"/>
+        </w:numPr>
+      </w:pPr>
+      <w:r>
+        <w:rPr>
+          <w:rStyle w:val="VerbatimChar"/>
+        </w:rPr>
+        <w:t xml:space="preserve">PermisosController::store</w:t>
+      </w:r>
+      <w:r>
+        <w:t xml:space="preserve"> </w:t>
+      </w:r>
+      <w:r>
+        <w:t xml:space="preserve">audita</w:t>
+      </w:r>
+      <w:r>
+        <w:t xml:space="preserve"> </w:t>
+      </w:r>
+      <w:r>
+        <w:rPr>
+          <w:rStyle w:val="VerbatimChar"/>
+        </w:rPr>
+        <w:t xml:space="preserve">SOLICITAR</w:t>
+      </w:r>
+      <w:r>
+        <w:t xml:space="preserve">; export de permisos con rango obligatorio + tope</w:t>
+      </w:r>
+      <w:r>
+        <w:t xml:space="preserve"> </w:t>
+      </w:r>
+      <w:r>
+        <w:t xml:space="preserve">5000 (spec 04 §10.8–9).</w:t>
+      </w:r>
+    </w:p>
+    <w:p>
+      <w:pPr>
+        <w:pStyle w:val="Compact"/>
+        <w:numPr>
+          <w:ilvl w:val="1"/>
+          <w:numId w:val="1015"/>
+        </w:numPr>
+      </w:pPr>
+      <w:r>
+        <w:rPr>
+          <w:rStyle w:val="VerbatimChar"/>
+        </w:rPr>
+        <w:t xml:space="preserve">ProcesarCuadre</w:t>
+      </w:r>
+      <w:r>
+        <w:t xml:space="preserve"> </w:t>
+      </w:r>
+      <w:r>
+        <w:t xml:space="preserve">marca</w:t>
+      </w:r>
+      <w:r>
+        <w:t xml:space="preserve"> </w:t>
+      </w:r>
+      <w:r>
+        <w:rPr>
+          <w:rStyle w:val="VerbatimChar"/>
+        </w:rPr>
+        <w:t xml:space="preserve">procesado = 'SI'</w:t>
+      </w:r>
+      <w:r>
+        <w:t xml:space="preserve">; fallback por posición eliminado (spec 03 §12.3–4).</w:t>
+      </w:r>
+    </w:p>
+    <w:p>
+      <w:pPr>
+        <w:pStyle w:val="Compact"/>
+        <w:numPr>
+          <w:ilvl w:val="1"/>
+          <w:numId w:val="1015"/>
+        </w:numPr>
+      </w:pPr>
+      <w:r>
+        <w:rPr>
+          <w:rStyle w:val="VerbatimChar"/>
+        </w:rPr>
+        <w:t xml:space="preserve">AsistenciaController::marcar</w:t>
+      </w:r>
+      <w:r>
+        <w:t xml:space="preserve"> </w:t>
+      </w:r>
+      <w:r>
+        <w:t xml:space="preserve">falla cerrado ante modalidad desconocida (spec 03 §12.5);</w:t>
+      </w:r>
+      <w:r>
+        <w:t xml:space="preserve"> </w:t>
+      </w:r>
+      <w:r>
+        <w:rPr>
+          <w:rStyle w:val="VerbatimChar"/>
+        </w:rPr>
+        <w:t xml:space="preserve">listado()</w:t>
+      </w:r>
+      <w:r>
+        <w:t xml:space="preserve"> </w:t>
+      </w:r>
+      <w:r>
+        <w:t xml:space="preserve">con techo 2000 (§12.8).</w:t>
+      </w:r>
+    </w:p>
+    <w:p>
+      <w:pPr>
+        <w:pStyle w:val="Compact"/>
+        <w:numPr>
+          <w:ilvl w:val="1"/>
+          <w:numId w:val="1015"/>
+        </w:numPr>
+      </w:pPr>
+      <w:r>
+        <w:t xml:space="preserve">Monitoreo de</w:t>
+      </w:r>
+      <w:r>
+        <w:t xml:space="preserve"> </w:t>
+      </w:r>
+      <w:r>
+        <w:rPr>
+          <w:rStyle w:val="VerbatimChar"/>
+        </w:rPr>
+        <w:t xml:space="preserve">schedule:run</w:t>
+      </w:r>
+      <w:r>
+        <w:t xml:space="preserve">:</w:t>
+      </w:r>
+      <w:r>
+        <w:t xml:space="preserve"> </w:t>
+      </w:r>
+      <w:r>
+        <w:rPr>
+          <w:rStyle w:val="VerbatimChar"/>
+        </w:rPr>
+        <w:t xml:space="preserve">ULTIMO_CUADRE_PROCESADO</w:t>
+      </w:r>
+      <w:r>
+        <w:t xml:space="preserve"> </w:t>
+      </w:r>
+      <w:r>
+        <w:t xml:space="preserve">en</w:t>
+      </w:r>
+      <w:r>
+        <w:t xml:space="preserve"> </w:t>
+      </w:r>
+      <w:r>
+        <w:rPr>
+          <w:rStyle w:val="VerbatimChar"/>
+        </w:rPr>
+        <w:t xml:space="preserve">d2_configuracion</w:t>
+      </w:r>
+      <w:r>
+        <w:t xml:space="preserve"> </w:t>
+      </w:r>
+      <w:r>
+        <w:t xml:space="preserve">+ banner en el</w:t>
+      </w:r>
+      <w:r>
+        <w:t xml:space="preserve"> </w:t>
+      </w:r>
+      <w:r>
+        <w:t xml:space="preserve">dashboard de Admin/TH si el cuadre lleva &gt; 26 h sin correr (spec 03 §12.6).</w:t>
+      </w:r>
+    </w:p>
+    <w:p>
+      <w:pPr>
+        <w:pStyle w:val="Compact"/>
+        <w:numPr>
+          <w:ilvl w:val="1"/>
+          <w:numId w:val="1015"/>
+        </w:numPr>
+      </w:pPr>
+      <w:r>
+        <w:rPr>
+          <w:b/>
+          <w:bCs/>
+        </w:rPr>
+        <w:t xml:space="preserve">Dejados sin tocar a propósito:</w:t>
+      </w:r>
+      <w:r>
+        <w:t xml:space="preserve"> </w:t>
+      </w:r>
+      <w:r>
+        <w:rPr>
+          <w:rStyle w:val="VerbatimChar"/>
+        </w:rPr>
+        <w:t xml:space="preserve">d2_cuadre_marcacion.ip</w:t>
+      </w:r>
+      <w:r>
+        <w:t xml:space="preserve"> </w:t>
+      </w:r>
+      <w:r>
+        <w:t xml:space="preserve">fijo; patrón de autorización mixto</w:t>
+      </w:r>
+      <w:r>
+        <w:t xml:space="preserve"> </w:t>
+      </w:r>
+      <w:r>
+        <w:t xml:space="preserve">de</w:t>
+      </w:r>
+      <w:r>
+        <w:t xml:space="preserve"> </w:t>
+      </w:r>
+      <w:r>
+        <w:rPr>
+          <w:rStyle w:val="VerbatimChar"/>
+        </w:rPr>
+        <w:t xml:space="preserve">PermisosController</w:t>
+      </w:r>
+      <w:r>
+        <w:t xml:space="preserve">;</w:t>
+      </w:r>
+      <w:r>
+        <w:t xml:space="preserve"> </w:t>
+      </w:r>
+      <w:r>
+        <w:rPr>
+          <w:rStyle w:val="VerbatimChar"/>
+        </w:rPr>
+        <w:t xml:space="preserve">index</w:t>
+      </w:r>
+      <w:r>
+        <w:t xml:space="preserve"> </w:t>
+      </w:r>
+      <w:r>
+        <w:t xml:space="preserve">de vacaciones sin export.</w:t>
+      </w:r>
+    </w:p>
+    <w:p>
+      <w:pPr>
+        <w:pStyle w:val="Compact"/>
+        <w:numPr>
+          <w:ilvl w:val="0"/>
+          <w:numId w:val="1012"/>
+        </w:numPr>
+      </w:pPr>
+      <w:r>
+        <w:rPr>
+          <w:b/>
+          <w:bCs/>
+        </w:rPr>
+        <w:t xml:space="preserve">Acciones de Personal (2026-09-03):</w:t>
+      </w:r>
+      <w:r>
+        <w:t xml:space="preserve"> </w:t>
+      </w:r>
+      <w:r>
+        <w:rPr>
+          <w:rStyle w:val="VerbatimChar"/>
+        </w:rPr>
+        <w:t xml:space="preserve">AccionPersonalController</w:t>
+      </w:r>
+      <w:r>
+        <w:t xml:space="preserve"> </w:t>
+      </w:r>
+      <w:r>
+        <w:t xml:space="preserve">instrumentado con auditoría</w:t>
+      </w:r>
+      <w:r>
+        <w:t xml:space="preserve"> </w:t>
+      </w:r>
+      <w:r>
+        <w:t xml:space="preserve">(</w:t>
+      </w:r>
+      <w:r>
+        <w:rPr>
+          <w:rStyle w:val="VerbatimChar"/>
+        </w:rPr>
+        <w:t xml:space="preserve">CREAR</w:t>
+      </w:r>
+      <w:r>
+        <w:t xml:space="preserve">/</w:t>
+      </w:r>
+      <w:r>
+        <w:rPr>
+          <w:rStyle w:val="VerbatimChar"/>
+        </w:rPr>
+        <w:t xml:space="preserve">PROCESAR</w:t>
+      </w:r>
+      <w:r>
+        <w:t xml:space="preserve">/</w:t>
+      </w:r>
+      <w:r>
+        <w:rPr>
+          <w:rStyle w:val="VerbatimChar"/>
+        </w:rPr>
+        <w:t xml:space="preserve">EDITAR_BORRADOR</w:t>
+      </w:r>
+      <w:r>
+        <w:t xml:space="preserve">/</w:t>
+      </w:r>
+      <w:r>
+        <w:rPr>
+          <w:rStyle w:val="VerbatimChar"/>
+        </w:rPr>
+        <w:t xml:space="preserve">CAMBIAR_ESTADO</w:t>
+      </w:r>
+      <w:r>
+        <w:t xml:space="preserve">/</w:t>
+      </w:r>
+      <w:r>
+        <w:rPr>
+          <w:rStyle w:val="VerbatimChar"/>
+        </w:rPr>
+        <w:t xml:space="preserve">SUBIR_FIRMADO</w:t>
+      </w:r>
+      <w:r>
+        <w:t xml:space="preserve">);</w:t>
+      </w:r>
+      <w:r>
+        <w:t xml:space="preserve"> </w:t>
+      </w:r>
+      <w:r>
+        <w:rPr>
+          <w:rStyle w:val="VerbatimChar"/>
+        </w:rPr>
+        <w:t xml:space="preserve">store()</w:t>
+      </w:r>
+      <w:r>
+        <w:t xml:space="preserve"> </w:t>
+      </w:r>
+      <w:r>
+        <w:t xml:space="preserve">valida el estado</w:t>
+      </w:r>
+      <w:r>
+        <w:t xml:space="preserve"> </w:t>
+      </w:r>
+      <w:r>
+        <w:t xml:space="preserve">del empleado según el tipo;</w:t>
+      </w:r>
+      <w:r>
+        <w:t xml:space="preserve"> </w:t>
+      </w:r>
+      <w:r>
+        <w:rPr>
+          <w:rStyle w:val="VerbatimChar"/>
+        </w:rPr>
+        <w:t xml:space="preserve">cambiarEstado()</w:t>
+      </w:r>
+      <w:r>
+        <w:t xml:space="preserve"> </w:t>
+      </w:r>
+      <w:r>
+        <w:t xml:space="preserve">solo permite</w:t>
+      </w:r>
+      <w:r>
+        <w:t xml:space="preserve"> </w:t>
+      </w:r>
+      <w:r>
+        <w:rPr>
+          <w:rStyle w:val="VerbatimChar"/>
+        </w:rPr>
+        <w:t xml:space="preserve">ACTIVO → FINALIZADO/ANULADO</w:t>
+      </w:r>
+      <w:r>
+        <w:t xml:space="preserve">;</w:t>
+      </w:r>
+      <w:r>
+        <w:t xml:space="preserve"> </w:t>
+      </w:r>
+      <w:r>
+        <w:t xml:space="preserve">numeración con advisory lock +</w:t>
+      </w:r>
+      <w:r>
+        <w:t xml:space="preserve"> </w:t>
+      </w:r>
+      <w:r>
+        <w:rPr>
+          <w:rStyle w:val="VerbatimChar"/>
+        </w:rPr>
+        <w:t xml:space="preserve">DB::transaction()</w:t>
+      </w:r>
+      <w:r>
+        <w:t xml:space="preserve">; auto-cierre movido a</w:t>
+      </w:r>
+      <w:r>
+        <w:t xml:space="preserve"> </w:t>
+      </w:r>
+      <w:r>
+        <w:rPr>
+          <w:rStyle w:val="VerbatimChar"/>
+        </w:rPr>
+        <w:t xml:space="preserve">php artisan cerrar:acciones-vencidas</w:t>
+      </w:r>
+      <w:r>
+        <w:t xml:space="preserve"> </w:t>
+      </w:r>
+      <w:r>
+        <w:t xml:space="preserve">(06:00, incluye COMISION DE SERVICIOS) — ya no es efecto</w:t>
+      </w:r>
+      <w:r>
+        <w:t xml:space="preserve"> </w:t>
+      </w:r>
+      <w:r>
+        <w:t xml:space="preserve">secundario de un GET (spec 06 §11).</w:t>
       </w:r>
     </w:p>
     <w:p>
@@ -6655,6 +7436,12 @@
     <w:abstractNumId w:val="991"/>
   </w:num>
   <w:num w:numId="1013">
+    <w:abstractNumId w:val="991"/>
+  </w:num>
+  <w:num w:numId="1014">
+    <w:abstractNumId w:val="991"/>
+  </w:num>
+  <w:num w:numId="1015">
     <w:abstractNumId w:val="991"/>
   </w:num>
 </w:numbering>

</xml_diff>